<commit_message>
My Website Project 1
</commit_message>
<xml_diff>
--- a/project/My website project.docx
+++ b/project/My website project.docx
@@ -71,7 +71,15 @@
         <w:t xml:space="preserve"> Guidance on seminary and institute programs, enrollment steps, schedules, and inspiring student testimonies.</w:t>
       </w:r>
       <w:r>
-        <w:t xml:space="preserve"> [Plus statistics]</w:t>
+        <w:t xml:space="preserve"> [</w:t>
+      </w:r>
+      <w:proofErr w:type="gramStart"/>
+      <w:r>
+        <w:t>Plus</w:t>
+      </w:r>
+      <w:proofErr w:type="gramEnd"/>
+      <w:r>
+        <w:t xml:space="preserve"> statistics]</w:t>
       </w:r>
     </w:p>
     <w:p>
@@ -101,7 +109,15 @@
         <w:t>Youth Activities &amp; Events:</w:t>
       </w:r>
       <w:r>
-        <w:t xml:space="preserve"> Announcements, reports, and highlights of talent shows, service projects, and mobilization activities, with photos and motivational messages.</w:t>
+        <w:t xml:space="preserve"> Announcements, reports, and highlights of talent </w:t>
+      </w:r>
+      <w:proofErr w:type="gramStart"/>
+      <w:r>
+        <w:t>shows</w:t>
+      </w:r>
+      <w:proofErr w:type="gramEnd"/>
+      <w:r>
+        <w:t>, service projects, and mobilization activities, with photos and motivational messages.</w:t>
       </w:r>
     </w:p>
     <w:p>
@@ -223,7 +239,19 @@
         <w:jc w:val="both"/>
       </w:pPr>
       <w:r>
-        <w:t xml:space="preserve">Site name: </w:t>
+        <w:t>The s</w:t>
+      </w:r>
+      <w:r>
+        <w:t>ite name</w:t>
+      </w:r>
+      <w:r>
+        <w:t xml:space="preserve"> is</w:t>
+      </w:r>
+      <w:r>
+        <w:t xml:space="preserve"> </w:t>
+      </w:r>
+      <w:r>
+        <w:t>“</w:t>
       </w:r>
       <w:r>
         <w:rPr>
@@ -232,6 +260,13 @@
         </w:rPr>
         <w:t>DRC Kinshasa Seminaries &amp; Institutes Coordination</w:t>
       </w:r>
+      <w:r>
+        <w:rPr>
+          <w:b/>
+          <w:bCs/>
+        </w:rPr>
+        <w:t>”.</w:t>
+      </w:r>
     </w:p>
     <w:p>
       <w:pPr>
@@ -265,7 +300,15 @@
         <w:t xml:space="preserve">as </w:t>
       </w:r>
       <w:r>
-        <w:t>a seminaries and Institutes Coordinator. The name best describe my area of action.</w:t>
+        <w:t xml:space="preserve">a seminaries and Institutes Coordinator. The name best </w:t>
+      </w:r>
+      <w:proofErr w:type="gramStart"/>
+      <w:r>
+        <w:t>describe</w:t>
+      </w:r>
+      <w:proofErr w:type="gramEnd"/>
+      <w:r>
+        <w:t xml:space="preserve"> my area of action.</w:t>
       </w:r>
       <w:r>
         <w:t xml:space="preserve"> </w:t>
@@ -303,7 +346,15 @@
         <w:t>of</w:t>
       </w:r>
       <w:r>
-        <w:t xml:space="preserve"> a seminaries and Institutes </w:t>
+        <w:t xml:space="preserve"> </w:t>
+      </w:r>
+      <w:proofErr w:type="gramStart"/>
+      <w:r>
+        <w:t>a seminaries</w:t>
+      </w:r>
+      <w:proofErr w:type="gramEnd"/>
+      <w:r>
+        <w:t xml:space="preserve"> and Institutes </w:t>
       </w:r>
       <w:r>
         <w:t xml:space="preserve">of Religion </w:t>
@@ -429,7 +480,15 @@
         <w:t>#003785</w:t>
       </w:r>
       <w:r>
-        <w:t xml:space="preserve"> is commonly known as Air Force Blue (USAF), a deep, cool shade of dark blue that sits between Prussian blue and Catalina blue on the spectrum. It is often described simply as dark blue or medium-dark cyan-blue depending on the context</w:t>
+        <w:t xml:space="preserve"> is commonly known as Air Force Blue (USAF), a deep, cool shade of dark blue that sits between Prussian blue and Catalina blue on the spectrum. It is often described simply as dark blue or medium-dark </w:t>
+      </w:r>
+      <w:proofErr w:type="gramStart"/>
+      <w:r>
+        <w:t>cyan-blue</w:t>
+      </w:r>
+      <w:proofErr w:type="gramEnd"/>
+      <w:r>
+        <w:t xml:space="preserve"> depending on the context</w:t>
       </w:r>
     </w:p>
     <w:p>

</xml_diff>